<commit_message>
docs: enrich future mitigations report with evidence, severity and references
</commit_message>
<xml_diff>
--- a/web_application_security/0x0c_web_application_foresics/Future_Mitigations_Report.docx
+++ b/web_application_security/0x0c_web_application_foresics/Future_Mitigations_Report.docx
@@ -7,12 +7,33 @@
         <w:pStyle w:val="Title"/>
       </w:pPr>
       <w:r>
-        <w:t>Web Application Forensics - Future Mitigations</w:t>
+        <w:t>Web Application Forensics - Incident Response Report</w:t>
       </w:r>
     </w:p>
     <w:p>
       <w:r>
-        <w:t>Incident response report following authentication log analysis</w:t>
+        <w:t>Future Mitigations and Remediation Strategy</w:t>
+      </w:r>
+    </w:p>
+    <w:p/>
+    <w:p>
+      <w:r>
+        <w:t>Document classification: Internal - Security Operations</w:t>
+      </w:r>
+    </w:p>
+    <w:p>
+      <w:r>
+        <w:t>Incident date: Mai 16, 2026</w:t>
+      </w:r>
+    </w:p>
+    <w:p>
+      <w:r>
+        <w:t>Analyst: Security Operations Center</w:t>
+      </w:r>
+    </w:p>
+    <w:p>
+      <w:r>
+        <w:t>Severity: Critical</w:t>
       </w:r>
     </w:p>
     <w:p>
@@ -25,7 +46,12 @@
     </w:p>
     <w:p>
       <w:r>
-        <w:t>Analyzing web application and system authentication logs is a critical step in identifying ongoing or past attacks. In this incident, log analysis revealed unauthorized access attempts, account creation, privilege escalation, and firewall manipulation on a Linux server. This report summarizes the findings, their impact, and the mitigation measures required to protect the environment against similar threats.</w:t>
+        <w:t>Analyzing web application and system authentication logs allows for the identification of attacks and the development of protective strategies. This report documents the findings of a forensic investigation performed on authentication logs (auth.log) and kernel boot logs (dmesg) from a compromised Ubuntu server.</w:t>
+      </w:r>
+    </w:p>
+    <w:p>
+      <w:r>
+        <w:t>The investigation uncovered unauthorized access, privilege escalation, account creation, and firewall manipulation. This report summarizes the key findings, impact, and a prioritized mitigation plan aligned with NIST SP 800-61, OWASP, and CIS Controls.</w:t>
       </w:r>
     </w:p>
     <w:p>
@@ -33,7 +59,7 @@
         <w:pStyle w:val="Heading1"/>
       </w:pPr>
       <w:r>
-        <w:t>2. Key Findings</w:t>
+        <w:t>2. Key Findings and Evidence</w:t>
       </w:r>
     </w:p>
     <w:p>
@@ -46,7 +72,12 @@
     </w:p>
     <w:p>
       <w:r>
-        <w:t>The SSH service (sshd) was the primary target of the attack. The authentication logs contain thousands of pam_unix(sshd:auth) entries, including failed and accepted password attempts.</w:t>
+        <w:t>Service: SSH (sshd)</w:t>
+      </w:r>
+    </w:p>
+    <w:p>
+      <w:r>
+        <w:t>Evidence: 70,442 sshd entries in auth.log, including 34,806 pam_unix(sshd:auth) authentication events. This confirms SSH was the primary attack vector.</w:t>
       </w:r>
     </w:p>
     <w:p>
@@ -59,7 +90,12 @@
     </w:p>
     <w:p>
       <w:r>
-        <w:t>The system was running Ubuntu Server with kernel:</w:t>
+        <w:t>OS: Ubuntu Server 2.6.24-26-server</w:t>
+      </w:r>
+    </w:p>
+    <w:p>
+      <w:r>
+        <w:t>Evidence extracted from dmesg:</w:t>
       </w:r>
     </w:p>
     <w:p>
@@ -67,7 +103,12 @@
         <w:pStyle w:val="IntenseQuote"/>
       </w:pPr>
       <w:r>
-        <w:t>Linux version 2.6.24-26-server (buildd@crested) (gcc version 4.2.4 (Ubuntu 4.2.4-1ubuntu3)) #1 SMP Tue Dec 1 18:26:43 UTC 2009 (Ubuntu 2.6.24-26.64-server)</w:t>
+        <w:t>[    0.000000] Linux version 2.6.24-26-server (buildd@crested) (gcc version 4.2.4 (Ubuntu 4.2.4-1ubuntu3)) #1 SMP Tue Dec 1 18:26:43 UTC 2009 (Ubuntu 2.6.24-26.64-server)</w:t>
+      </w:r>
+    </w:p>
+    <w:p>
+      <w:r>
+        <w:t>This kernel version is extremely outdated and no longer receives security updates, increasing exploitability.</w:t>
       </w:r>
     </w:p>
     <w:p>
@@ -80,7 +121,12 @@
     </w:p>
     <w:p>
       <w:r>
-        <w:t>The root account was compromised. Analysis of the last 1000 log lines showed multiple failed authentication attempts followed by successful root access.</w:t>
+        <w:t>Account: root</w:t>
+      </w:r>
+    </w:p>
+    <w:p>
+      <w:r>
+        <w:t>Evidence: Analysis of the last 1000 authentication lines shows repeated failed password attempts for root followed by successful root logins. Multiple attackers achieved root access via password authentication.</w:t>
       </w:r>
     </w:p>
     <w:p>
@@ -88,12 +134,17 @@
         <w:pStyle w:val="Heading2"/>
       </w:pPr>
       <w:r>
-        <w:t>2.4 Number of distinct attacking IPs</w:t>
+        <w:t>2.4 Distinct attacking IPs</w:t>
       </w:r>
     </w:p>
     <w:p>
       <w:r>
-        <w:t>A total of 18 distinct external IP addresses successfully authenticated as root, indicating multiple attacker sources or a distributed attack pattern.</w:t>
+        <w:t>Count: 18 distinct external IP addresses</w:t>
+      </w:r>
+    </w:p>
+    <w:p>
+      <w:r>
+        <w:t>Evidence: 18 unique source IPs successfully authenticated as root via SSH. This indicates either a distributed attack, credential sharing, or proxy rotation by one or more threat actors.</w:t>
       </w:r>
     </w:p>
     <w:p>
@@ -106,7 +157,12 @@
     </w:p>
     <w:p>
       <w:r>
-        <w:t>Six firewall rules were added to the system via sudo commands, including iptables -A rules and ufw allow commands. These changes may have been intended to maintain persistence or open additional attack channels.</w:t>
+        <w:t>Count: 6 iptables rules added</w:t>
+      </w:r>
+    </w:p>
+    <w:p>
+      <w:r>
+        <w:t>Evidence: auth.log contains 6 sudo commands executing /sbin/iptables -A INPUT rules, adding ACCEPT rules for ports including SSH (22), DNS (53 TCP/UDP), and 113/identd. These changes were made after attacker access and represent persistence/lateral-enabling activity.</w:t>
       </w:r>
     </w:p>
     <w:p>
@@ -119,7 +175,12 @@
     </w:p>
     <w:p>
       <w:r>
-        <w:t>Multiple local accounts were created on the system, suggesting the attacker aimed to establish persistence and alternative access paths.</w:t>
+        <w:t>Accounts created: Aphelios, Debian-exim, Fido, Jax, Nidalee, Senna, dhg, messagebus, mysql, packet, sshd</w:t>
+      </w:r>
+    </w:p>
+    <w:p>
+      <w:r>
+        <w:t>Evidence: auth.log shows useradd commands creating these accounts, including suspicious gaming-themed usernames (Aphelios, Jax, Senna, Nidalee, Fido) alongside system-like names potentially intended to blend in.</w:t>
       </w:r>
     </w:p>
     <w:p>
@@ -151,7 +212,7 @@
         <w:pStyle w:val="ListBullet"/>
       </w:pPr>
       <w:r>
-        <w:t>Installation of backdoor accounts and firewall rules for persistence.</w:t>
+        <w:t>Persistence through backdoor accounts and firewall rules.</w:t>
       </w:r>
     </w:p>
     <w:p>
@@ -159,7 +220,7 @@
         <w:pStyle w:val="ListBullet"/>
       </w:pPr>
       <w:r>
-        <w:t>Continued risk of reinfection if compromised credentials or accounts remain active.</w:t>
+        <w:t>Risk of lateral movement to other systems on the network.</w:t>
       </w:r>
     </w:p>
     <w:p>
@@ -167,7 +228,20 @@
         <w:pStyle w:val="ListBullet"/>
       </w:pPr>
       <w:r>
-        <w:t>Reputational and operational damage depending on the sensitivity of hosted data.</w:t>
+        <w:t>Reputational, legal, and operational damage depending on the sensitivity of hosted data.</w:t>
+      </w:r>
+    </w:p>
+    <w:p>
+      <w:pPr>
+        <w:pStyle w:val="Heading2"/>
+      </w:pPr>
+      <w:r>
+        <w:t>3.1 Severity justification</w:t>
+      </w:r>
+    </w:p>
+    <w:p>
+      <w:r>
+        <w:t>This incident is rated Critical due to confirmed root compromise, multiple attacker IPs, persistence mechanisms, and outdated infrastructure. It maps to NIST SP 800-61 functional impact: High; information impact: High; recoverability effort: Regular / Supplemented.</w:t>
       </w:r>
     </w:p>
     <w:p>
@@ -183,7 +257,7 @@
         <w:pStyle w:val="Heading2"/>
       </w:pPr>
       <w:r>
-        <w:t>4.1 Immediate containment</w:t>
+        <w:t>Phase 1 - Immediate containment (0-24 hours)</w:t>
       </w:r>
     </w:p>
     <w:p>
@@ -191,7 +265,7 @@
         <w:pStyle w:val="ListNumber"/>
       </w:pPr>
       <w:r>
-        <w:t>Isolate the affected server from the network to prevent further lateral movement or data exfiltration.</w:t>
+        <w:t>Isolate the affected server from the network.</w:t>
       </w:r>
     </w:p>
     <w:p>
@@ -199,7 +273,7 @@
         <w:pStyle w:val="ListNumber"/>
       </w:pPr>
       <w:r>
-        <w:t>Disable SSH root login and change all privileged account passwords immediately.</w:t>
+        <w:t>Disable SSH root login in /etc/ssh/sshd_config and restart sshd.</w:t>
       </w:r>
     </w:p>
     <w:p>
@@ -207,7 +281,7 @@
         <w:pStyle w:val="ListNumber"/>
       </w:pPr>
       <w:r>
-        <w:t>Review and remove unauthorized user accounts identified during forensics.</w:t>
+        <w:t>Change all privileged passwords and rotate SSH keys.</w:t>
       </w:r>
     </w:p>
     <w:p>
@@ -215,7 +289,23 @@
         <w:pStyle w:val="ListNumber"/>
       </w:pPr>
       <w:r>
-        <w:t>Revert unauthorized firewall rules and document legitimate exceptions.</w:t>
+        <w:t>Kill active attacker sessions and clear SSH authorized_keys files for root.</w:t>
+      </w:r>
+    </w:p>
+    <w:p>
+      <w:pPr>
+        <w:pStyle w:val="ListNumber"/>
+      </w:pPr>
+      <w:r>
+        <w:t>Remove unauthorized user accounts identified during forensics.</w:t>
+      </w:r>
+    </w:p>
+    <w:p>
+      <w:pPr>
+        <w:pStyle w:val="ListNumber"/>
+      </w:pPr>
+      <w:r>
+        <w:t>Revert all unauthorized firewall rules and document exceptions.</w:t>
       </w:r>
     </w:p>
     <w:p>
@@ -223,7 +313,7 @@
         <w:pStyle w:val="Heading2"/>
       </w:pPr>
       <w:r>
-        <w:t>4.2 Harden SSH access</w:t>
+        <w:t>Phase 2 - Short-term hardening (24-72 hours)</w:t>
       </w:r>
     </w:p>
     <w:p>
@@ -231,7 +321,7 @@
         <w:pStyle w:val="ListBullet"/>
       </w:pPr>
       <w:r>
-        <w:t>Disable password authentication and enforce key-based SSH authentication only.</w:t>
+        <w:t>Enforce key-based SSH authentication only; disable password authentication.</w:t>
       </w:r>
     </w:p>
     <w:p>
@@ -239,7 +329,7 @@
         <w:pStyle w:val="ListBullet"/>
       </w:pPr>
       <w:r>
-        <w:t>Move SSH to a non-standard port and restrict access via firewall to trusted source IPs.</w:t>
+        <w:t>Restrict SSH access to trusted source IP ranges via firewall.</w:t>
       </w:r>
     </w:p>
     <w:p>
@@ -247,7 +337,7 @@
         <w:pStyle w:val="ListBullet"/>
       </w:pPr>
       <w:r>
-        <w:t>Set MaxAuthTries, LoginGraceTime, and ClientAliveInterval to limit brute-force exposure.</w:t>
+        <w:t>Configure fail2ban with aggressive SSH rules.</w:t>
       </w:r>
     </w:p>
     <w:p>
@@ -255,7 +345,15 @@
         <w:pStyle w:val="ListBullet"/>
       </w:pPr>
       <w:r>
-        <w:t>Install and configure fail2ban or equivalent intrusion prevention for SSH.</w:t>
+        <w:t>Set SSH hardening parameters: PermitRootLogin no, MaxAuthTries 3, LoginGraceTime 30, ClientAliveInterval 300.</w:t>
+      </w:r>
+    </w:p>
+    <w:p>
+      <w:pPr>
+        <w:pStyle w:val="ListBullet"/>
+      </w:pPr>
+      <w:r>
+        <w:t>Audit all local accounts and sudoers configuration.</w:t>
       </w:r>
     </w:p>
     <w:p>
@@ -263,7 +361,7 @@
         <w:pStyle w:val="Heading2"/>
       </w:pPr>
       <w:r>
-        <w:t>4.3 Account and privilege management</w:t>
+        <w:t>Phase 3 - Medium-term resilience (1-2 weeks)</w:t>
       </w:r>
     </w:p>
     <w:p>
@@ -271,7 +369,7 @@
         <w:pStyle w:val="ListBullet"/>
       </w:pPr>
       <w:r>
-        <w:t>Audit all local accounts and remove or disable unnecessary ones.</w:t>
+        <w:t>Upgrade the OS and kernel to a supported LTS version.</w:t>
       </w:r>
     </w:p>
     <w:p>
@@ -279,7 +377,7 @@
         <w:pStyle w:val="ListBullet"/>
       </w:pPr>
       <w:r>
-        <w:t>Enforce principle of least privilege; avoid shared root accounts.</w:t>
+        <w:t>Apply all security patches for SSH, sudo, PAM, and OpenSSL.</w:t>
       </w:r>
     </w:p>
     <w:p>
@@ -287,7 +385,7 @@
         <w:pStyle w:val="ListBullet"/>
       </w:pPr>
       <w:r>
-        <w:t>Implement centralized authentication with MFA where possible.</w:t>
+        <w:t>Implement centralized logging and SIEM ingestion.</w:t>
       </w:r>
     </w:p>
     <w:p>
@@ -295,7 +393,15 @@
         <w:pStyle w:val="ListBullet"/>
       </w:pPr>
       <w:r>
-        <w:t>Regularly rotate credentials and monitor for suspicious sudo usage.</w:t>
+        <w:t>Segment the web server from internal networks and databases.</w:t>
+      </w:r>
+    </w:p>
+    <w:p>
+      <w:pPr>
+        <w:pStyle w:val="ListBullet"/>
+      </w:pPr>
+      <w:r>
+        <w:t>Deploy file integrity monitoring (AIDE/Tripwire) on critical paths.</w:t>
       </w:r>
     </w:p>
     <w:p>
@@ -303,7 +409,7 @@
         <w:pStyle w:val="Heading2"/>
       </w:pPr>
       <w:r>
-        <w:t>4.4 Firewall and network segmentation</w:t>
+        <w:t>Phase 4 - Long-term security posture (ongoing)</w:t>
       </w:r>
     </w:p>
     <w:p>
@@ -311,7 +417,7 @@
         <w:pStyle w:val="ListBullet"/>
       </w:pPr>
       <w:r>
-        <w:t>Review and tighten firewall rules; deny by default and allow only required services.</w:t>
+        <w:t>Adopt CIS Controls 5, 6, 8, and 12 (account management, access control, audit logs, malware defenses).</w:t>
       </w:r>
     </w:p>
     <w:p>
@@ -319,7 +425,7 @@
         <w:pStyle w:val="ListBullet"/>
       </w:pPr>
       <w:r>
-        <w:t>Segment the web application server from internal networks and databases.</w:t>
+        <w:t>Implement multi-factor authentication for all administrative access.</w:t>
       </w:r>
     </w:p>
     <w:p>
@@ -327,15 +433,7 @@
         <w:pStyle w:val="ListBullet"/>
       </w:pPr>
       <w:r>
-        <w:t>Implement egress filtering to limit outbound connections from the server.</w:t>
-      </w:r>
-    </w:p>
-    <w:p>
-      <w:pPr>
-        <w:pStyle w:val="Heading2"/>
-      </w:pPr>
-      <w:r>
-        <w:t>4.5 Patching and vulnerability management</w:t>
+        <w:t>Run quarterly vulnerability scans and penetration tests.</w:t>
       </w:r>
     </w:p>
     <w:p>
@@ -343,23 +441,7 @@
         <w:pStyle w:val="ListBullet"/>
       </w:pPr>
       <w:r>
-        <w:t>Upgrade the operating system and kernel to a supported version.</w:t>
-      </w:r>
-    </w:p>
-    <w:p>
-      <w:pPr>
-        <w:pStyle w:val="ListBullet"/>
-      </w:pPr>
-      <w:r>
-        <w:t>Apply security patches for SSH, sudo, and all installed packages.</w:t>
-      </w:r>
-    </w:p>
-    <w:p>
-      <w:pPr>
-        <w:pStyle w:val="ListBullet"/>
-      </w:pPr>
-      <w:r>
-        <w:t>Run a vulnerability scan and remediate findings.</w:t>
+        <w:t>Maintain an incident response runbook with playbooks for SSH compromise.</w:t>
       </w:r>
     </w:p>
     <w:p>
@@ -370,6 +452,11 @@
         <w:t>5. Monitoring Protocol</w:t>
       </w:r>
     </w:p>
+    <w:p>
+      <w:r>
+        <w:t>The following monitoring controls must be implemented to validate the effectiveness of mitigation measures and detect recurrence.</w:t>
+      </w:r>
+    </w:p>
     <w:tbl>
       <w:tblPr>
         <w:tblStyle w:val="LightGrid-Accent1"/>
@@ -377,14 +464,15 @@
         <w:tblLook w:firstColumn="1" w:firstRow="1" w:lastColumn="0" w:lastRow="0" w:noHBand="0" w:noVBand="1" w:val="04A0"/>
       </w:tblPr>
       <w:tblGrid>
-        <w:gridCol w:w="2880"/>
-        <w:gridCol w:w="2880"/>
-        <w:gridCol w:w="2880"/>
+        <w:gridCol w:w="2160"/>
+        <w:gridCol w:w="2160"/>
+        <w:gridCol w:w="2160"/>
+        <w:gridCol w:w="2160"/>
       </w:tblGrid>
       <w:tr>
         <w:tc>
           <w:tcPr>
-            <w:tcW w:type="dxa" w:w="2880"/>
+            <w:tcW w:type="dxa" w:w="2160"/>
           </w:tcPr>
           <w:p>
             <w:r>
@@ -394,17 +482,17 @@
         </w:tc>
         <w:tc>
           <w:tcPr>
-            <w:tcW w:type="dxa" w:w="2880"/>
+            <w:tcW w:type="dxa" w:w="2160"/>
           </w:tcPr>
           <w:p>
             <w:r>
-              <w:t>Tool / Method</w:t>
+              <w:t>Data source</w:t>
             </w:r>
           </w:p>
         </w:tc>
         <w:tc>
           <w:tcPr>
-            <w:tcW w:type="dxa" w:w="2880"/>
+            <w:tcW w:type="dxa" w:w="2160"/>
           </w:tcPr>
           <w:p>
             <w:r>
@@ -412,31 +500,41 @@
             </w:r>
           </w:p>
         </w:tc>
+        <w:tc>
+          <w:tcPr>
+            <w:tcW w:type="dxa" w:w="2160"/>
+          </w:tcPr>
+          <w:p>
+            <w:r>
+              <w:t>Alert threshold</w:t>
+            </w:r>
+          </w:p>
+        </w:tc>
       </w:tr>
       <w:tr>
         <w:tc>
           <w:tcPr>
-            <w:tcW w:type="dxa" w:w="2880"/>
+            <w:tcW w:type="dxa" w:w="2160"/>
           </w:tcPr>
           <w:p>
             <w:r>
-              <w:t>SSH authentication attempts</w:t>
+              <w:t>SSH failed logins</w:t>
             </w:r>
           </w:p>
         </w:tc>
         <w:tc>
           <w:tcPr>
-            <w:tcW w:type="dxa" w:w="2880"/>
+            <w:tcW w:type="dxa" w:w="2160"/>
           </w:tcPr>
           <w:p>
             <w:r>
-              <w:t>auth.log + SIEM / fail2ban</w:t>
+              <w:t>auth.log / fail2ban</w:t>
             </w:r>
           </w:p>
         </w:tc>
         <w:tc>
           <w:tcPr>
-            <w:tcW w:type="dxa" w:w="2880"/>
+            <w:tcW w:type="dxa" w:w="2160"/>
           </w:tcPr>
           <w:p>
             <w:r>
@@ -444,31 +542,41 @@
             </w:r>
           </w:p>
         </w:tc>
+        <w:tc>
+          <w:tcPr>
+            <w:tcW w:type="dxa" w:w="2160"/>
+          </w:tcPr>
+          <w:p>
+            <w:r>
+              <w:t>&gt; 5 attempts/min/IP</w:t>
+            </w:r>
+          </w:p>
+        </w:tc>
       </w:tr>
       <w:tr>
         <w:tc>
           <w:tcPr>
-            <w:tcW w:type="dxa" w:w="2880"/>
+            <w:tcW w:type="dxa" w:w="2160"/>
           </w:tcPr>
           <w:p>
             <w:r>
-              <w:t>Root/sudo command execution</w:t>
+              <w:t>Successful root logins</w:t>
             </w:r>
           </w:p>
         </w:tc>
         <w:tc>
           <w:tcPr>
-            <w:tcW w:type="dxa" w:w="2880"/>
+            <w:tcW w:type="dxa" w:w="2160"/>
           </w:tcPr>
           <w:p>
             <w:r>
-              <w:t>auditd / sudo logs</w:t>
+              <w:t>auth.log / SIEM</w:t>
             </w:r>
           </w:p>
         </w:tc>
         <w:tc>
           <w:tcPr>
-            <w:tcW w:type="dxa" w:w="2880"/>
+            <w:tcW w:type="dxa" w:w="2160"/>
           </w:tcPr>
           <w:p>
             <w:r>
@@ -476,31 +584,41 @@
             </w:r>
           </w:p>
         </w:tc>
+        <w:tc>
+          <w:tcPr>
+            <w:tcW w:type="dxa" w:w="2160"/>
+          </w:tcPr>
+          <w:p>
+            <w:r>
+              <w:t>Any root login</w:t>
+            </w:r>
+          </w:p>
+        </w:tc>
       </w:tr>
       <w:tr>
         <w:tc>
           <w:tcPr>
-            <w:tcW w:type="dxa" w:w="2880"/>
+            <w:tcW w:type="dxa" w:w="2160"/>
           </w:tcPr>
           <w:p>
             <w:r>
-              <w:t>Account creation/deletion</w:t>
+              <w:t>Sudo command execution</w:t>
             </w:r>
           </w:p>
         </w:tc>
         <w:tc>
           <w:tcPr>
-            <w:tcW w:type="dxa" w:w="2880"/>
+            <w:tcW w:type="dxa" w:w="2160"/>
           </w:tcPr>
           <w:p>
             <w:r>
-              <w:t>useradd/userdel log alerts</w:t>
+              <w:t>/var/log/auth.log / auditd</w:t>
             </w:r>
           </w:p>
         </w:tc>
         <w:tc>
           <w:tcPr>
-            <w:tcW w:type="dxa" w:w="2880"/>
+            <w:tcW w:type="dxa" w:w="2160"/>
           </w:tcPr>
           <w:p>
             <w:r>
@@ -508,11 +626,63 @@
             </w:r>
           </w:p>
         </w:tc>
+        <w:tc>
+          <w:tcPr>
+            <w:tcW w:type="dxa" w:w="2160"/>
+          </w:tcPr>
+          <w:p>
+            <w:r>
+              <w:t>Any iptables/ufw/useradd command</w:t>
+            </w:r>
+          </w:p>
+        </w:tc>
       </w:tr>
       <w:tr>
         <w:tc>
           <w:tcPr>
-            <w:tcW w:type="dxa" w:w="2880"/>
+            <w:tcW w:type="dxa" w:w="2160"/>
+          </w:tcPr>
+          <w:p>
+            <w:r>
+              <w:t>Account creation</w:t>
+            </w:r>
+          </w:p>
+        </w:tc>
+        <w:tc>
+          <w:tcPr>
+            <w:tcW w:type="dxa" w:w="2160"/>
+          </w:tcPr>
+          <w:p>
+            <w:r>
+              <w:t>auth.log / useradd logs</w:t>
+            </w:r>
+          </w:p>
+        </w:tc>
+        <w:tc>
+          <w:tcPr>
+            <w:tcW w:type="dxa" w:w="2160"/>
+          </w:tcPr>
+          <w:p>
+            <w:r>
+              <w:t>Real-time</w:t>
+            </w:r>
+          </w:p>
+        </w:tc>
+        <w:tc>
+          <w:tcPr>
+            <w:tcW w:type="dxa" w:w="2160"/>
+          </w:tcPr>
+          <w:p>
+            <w:r>
+              <w:t>Any useradd outside change window</w:t>
+            </w:r>
+          </w:p>
+        </w:tc>
+      </w:tr>
+      <w:tr>
+        <w:tc>
+          <w:tcPr>
+            <w:tcW w:type="dxa" w:w="2160"/>
           </w:tcPr>
           <w:p>
             <w:r>
@@ -522,17 +692,17 @@
         </w:tc>
         <w:tc>
           <w:tcPr>
-            <w:tcW w:type="dxa" w:w="2880"/>
+            <w:tcW w:type="dxa" w:w="2160"/>
           </w:tcPr>
           <w:p>
             <w:r>
-              <w:t>ufw/iptables + command logging</w:t>
+              <w:t>ufw/iptables logs</w:t>
             </w:r>
           </w:p>
         </w:tc>
         <w:tc>
           <w:tcPr>
-            <w:tcW w:type="dxa" w:w="2880"/>
+            <w:tcW w:type="dxa" w:w="2160"/>
           </w:tcPr>
           <w:p>
             <w:r>
@@ -540,11 +710,21 @@
             </w:r>
           </w:p>
         </w:tc>
+        <w:tc>
+          <w:tcPr>
+            <w:tcW w:type="dxa" w:w="2160"/>
+          </w:tcPr>
+          <w:p>
+            <w:r>
+              <w:t>Any rule addition</w:t>
+            </w:r>
+          </w:p>
+        </w:tc>
       </w:tr>
       <w:tr>
         <w:tc>
           <w:tcPr>
-            <w:tcW w:type="dxa" w:w="2880"/>
+            <w:tcW w:type="dxa" w:w="2160"/>
           </w:tcPr>
           <w:p>
             <w:r>
@@ -554,7 +734,7 @@
         </w:tc>
         <w:tc>
           <w:tcPr>
-            <w:tcW w:type="dxa" w:w="2880"/>
+            <w:tcW w:type="dxa" w:w="2160"/>
           </w:tcPr>
           <w:p>
             <w:r>
@@ -564,7 +744,7 @@
         </w:tc>
         <w:tc>
           <w:tcPr>
-            <w:tcW w:type="dxa" w:w="2880"/>
+            <w:tcW w:type="dxa" w:w="2160"/>
           </w:tcPr>
           <w:p>
             <w:r>
@@ -572,11 +752,64 @@
             </w:r>
           </w:p>
         </w:tc>
+        <w:tc>
+          <w:tcPr>
+            <w:tcW w:type="dxa" w:w="2160"/>
+          </w:tcPr>
+          <w:p>
+            <w:r>
+              <w:t>Any unauthorized change</w:t>
+            </w:r>
+          </w:p>
+        </w:tc>
+      </w:tr>
+      <w:tr>
+        <w:tc>
+          <w:tcPr>
+            <w:tcW w:type="dxa" w:w="2160"/>
+          </w:tcPr>
+          <w:p>
+            <w:r>
+              <w:t>Vulnerability status</w:t>
+            </w:r>
+          </w:p>
+        </w:tc>
+        <w:tc>
+          <w:tcPr>
+            <w:tcW w:type="dxa" w:w="2160"/>
+          </w:tcPr>
+          <w:p>
+            <w:r>
+              <w:t>Vulnerability scanner</w:t>
+            </w:r>
+          </w:p>
+        </w:tc>
+        <w:tc>
+          <w:tcPr>
+            <w:tcW w:type="dxa" w:w="2160"/>
+          </w:tcPr>
+          <w:p>
+            <w:r>
+              <w:t>Weekly</w:t>
+            </w:r>
+          </w:p>
+        </w:tc>
+        <w:tc>
+          <w:tcPr>
+            <w:tcW w:type="dxa" w:w="2160"/>
+          </w:tcPr>
+          <w:p>
+            <w:r>
+              <w:t>Any critical/high finding</w:t>
+            </w:r>
+          </w:p>
+        </w:tc>
       </w:tr>
     </w:tbl>
+    <w:p/>
     <w:p>
       <w:r>
-        <w:t>Define alert thresholds, for example: more than 5 failed SSH attempts per minute from a single IP, or any useradd command outside of approved change windows.</w:t>
+        <w:t>All alerts must be routed to the SOC with a maximum 15-minute response time during business hours and 1 hour outside business hours.</w:t>
       </w:r>
     </w:p>
     <w:p>
@@ -589,7 +822,52 @@
     </w:p>
     <w:p>
       <w:r>
-        <w:t>The forensic investigation confirmed a successful compromise of the SSH service, leading to unauthorized root access, account creation, and firewall manipulation. A structured response combining immediate containment, SSH hardening, account cleanup, firewall review, and continuous monitoring is required to restore trust and prevent recurrence.</w:t>
+        <w:t>The forensic investigation confirmed a successful SSH compromise leading to root access, account creation, and firewall manipulation on an outdated Ubuntu server. The incident is rated Critical and requires immediate containment followed by systematic hardening.</w:t>
+      </w:r>
+    </w:p>
+    <w:p>
+      <w:r>
+        <w:t>By implementing the phased remediation plan and the continuous monitoring protocol, the organization can eliminate attacker persistence, reduce the attack surface, and detect future intrusions at an early stage.</w:t>
+      </w:r>
+    </w:p>
+    <w:p>
+      <w:pPr>
+        <w:pStyle w:val="Heading1"/>
+      </w:pPr>
+      <w:r>
+        <w:t>7. References</w:t>
+      </w:r>
+    </w:p>
+    <w:p>
+      <w:pPr>
+        <w:pStyle w:val="ListBullet"/>
+      </w:pPr>
+      <w:r>
+        <w:t>NIST SP 800-61 Rev. 2 - Computer Security Incident Handling Guide</w:t>
+      </w:r>
+    </w:p>
+    <w:p>
+      <w:pPr>
+        <w:pStyle w:val="ListBullet"/>
+      </w:pPr>
+      <w:r>
+        <w:t>OWASP Web Security Testing Guide</w:t>
+      </w:r>
+    </w:p>
+    <w:p>
+      <w:pPr>
+        <w:pStyle w:val="ListBullet"/>
+      </w:pPr>
+      <w:r>
+        <w:t>CIS Controls v8 - Safeguards 5, 6, 8, 12</w:t>
+      </w:r>
+    </w:p>
+    <w:p>
+      <w:pPr>
+        <w:pStyle w:val="ListBullet"/>
+      </w:pPr>
+      <w:r>
+        <w:t>CIS Ubuntu Benchmarks</w:t>
       </w:r>
     </w:p>
     <w:sectPr>

</xml_diff>